<commit_message>
vault backup: 2026-04-28 15:25:42
</commit_message>
<xml_diff>
--- a/030_Project/032_Proposed Project/09_개인기초 2차/연구계획서_초안_이승모_ALD_Li음극.docx
+++ b/030_Project/032_Proposed Project/09_개인기초 2차/연구계획서_초안_이승모_ALD_Li음극.docx
@@ -622,7 +622,7 @@
           <w:color w:val="333333"/>
           <w:sz w:val="18"/>
         </w:rPr>
-        <w:t>연구 로드맵 및 Task 구성도. 상단에 전체 연구 흐름(Task 1→2→3) 화살표 다이어그램, 하단에 4개 연차별 주요 연구 활동 간트 차트(Gantt chart). 각 Task 박스 내에 핵심 분석법 아이콘(TEM/XPS/EIS/DFT) 배치. 레이아웃: 세로형, A4 절반 크기.</w:t>
+        <w:t>연구 로드맵 및 Task 구성도. 상단에 전체 연구 흐름(Task 1→2→3) 화살표 다이어그램, 하단에 3개 연차별 주요 연구 활동 간트 차트(Gantt chart). 각 Task 박스 내에 핵심 분석법 아이콘(TEM/XPS/EIS/DFT) 배치. 레이아웃: 세로형, A4 절반 크기.</w:t>
       </w:r>
     </w:p>
     <w:p>
@@ -635,7 +635,7 @@
           <w:b/>
           <w:sz w:val="21"/>
         </w:rPr>
-        <w:t>Task 1. ALD 불화물 박막 합성 및 계면 특성 분석 (1~2년차)</w:t>
+        <w:t>Task 1. ALD 불화물 박막 합성 및 계면 특성 분석 (1년차)</w:t>
       </w:r>
     </w:p>
     <w:p>
@@ -687,7 +687,7 @@
           <w:b/>
           <w:sz w:val="21"/>
         </w:rPr>
-        <w:t>Task 2. In-situ/Operando 분석 기반 Li 핵생성 메커니즘 규명 (2~3년차)</w:t>
+        <w:t>Task 2. In-situ/Operando 분석 기반 Li 핵생성 메커니즘 규명 (1~2년차)</w:t>
       </w:r>
     </w:p>
     <w:p>
@@ -752,7 +752,7 @@
           <w:b/>
           <w:sz w:val="21"/>
         </w:rPr>
-        <w:t>Task 3. Full Cell 평가 및 인공 SEI 설계 원칙 도출 (3~4년차)</w:t>
+        <w:t>Task 3. Full Cell 평가 및 인공 SEI 설계 원칙 도출 (2~3년차)</w:t>
       </w:r>
     </w:p>
     <w:p>
@@ -900,7 +900,7 @@
                 <w:rFonts w:ascii="맑은 고딕" w:hAnsi="맑은 고딕"/>
                 <w:sz w:val="18"/>
               </w:rPr>
-              <w:t>ZnF2/AlF3 ALD 증착 조건 최적화, XPS/TEM 박막 분석</w:t>
+              <w:t>ZnF2/AlF3/LiF ALD 증착 조건 최적화, XPS/TEM 박막 분석, EIS 이온 전도도 평가, in-situ AFM 핵생성 관찰</w:t>
             </w:r>
           </w:p>
         </w:tc>
@@ -914,7 +914,7 @@
                 <w:rFonts w:ascii="맑은 고딕" w:hAnsi="맑은 고딕"/>
                 <w:sz w:val="18"/>
               </w:rPr>
-              <w:t>ALD 레시피 확립, 박막 특성 데이터</w:t>
+              <w:t>ALD 레시피 확립, 박막 특성 데이터, SCI 논문 1편</w:t>
             </w:r>
           </w:p>
         </w:tc>
@@ -944,7 +944,7 @@
                 <w:rFonts w:ascii="맑은 고딕" w:hAnsi="맑은 고딕"/>
                 <w:sz w:val="18"/>
               </w:rPr>
-              <w:t>In-situ AFM 핵생성 관찰, EIS 분석, 박막 두께-성능 상관관계 규명</w:t>
+              <w:t>Operando XRD/Cryo-TEM 충방전 중 SEI 진화 모니터링, DFT 계산(Li+ 확산 에너지 배리어), 박막 두께·조성 상관관계 데이터베이스 구축</w:t>
             </w:r>
           </w:p>
         </w:tc>
@@ -958,7 +958,7 @@
                 <w:rFonts w:ascii="맑은 고딕" w:hAnsi="맑은 고딕"/>
                 <w:sz w:val="18"/>
               </w:rPr>
-              <w:t>SCI 논문 1편, 핵생성 과전압 데이터베이스</w:t>
+              <w:t>SCI 논문 1편, 핵생성 메커니즘 규명, 특허 출원</w:t>
             </w:r>
           </w:p>
         </w:tc>
@@ -988,7 +988,7 @@
                 <w:rFonts w:ascii="맑은 고딕" w:hAnsi="맑은 고딕"/>
                 <w:sz w:val="18"/>
               </w:rPr>
-              <w:t>Operando XRD/Cryo-TEM, DFT 계산, Full cell 프로토타입 제작</w:t>
+              <w:t>Li||NCM Full cell 장기 사이클 평가(&gt;300회), Post-mortem 분석, ZnF2/AlF3/LiF 비교, 인공 SEI 설계 원칙 도출</w:t>
             </w:r>
           </w:p>
         </w:tc>
@@ -1002,51 +1002,7 @@
                 <w:rFonts w:ascii="맑은 고딕" w:hAnsi="맑은 고딕"/>
                 <w:sz w:val="18"/>
               </w:rPr>
-              <w:t>SCI 논문 1편, 메커니즘 규명</w:t>
-            </w:r>
-          </w:p>
-        </w:tc>
-      </w:tr>
-      <w:tr>
-        <w:tc>
-          <w:tcPr>
-            <w:tcW w:type="dxa" w:w="3024"/>
-          </w:tcPr>
-          <w:p>
-            <w:r>
-              <w:rPr>
-                <w:rFonts w:ascii="맑은 고딕" w:hAnsi="맑은 고딕"/>
-                <w:sz w:val="18"/>
-              </w:rPr>
-              <w:t>4년차</w:t>
-            </w:r>
-          </w:p>
-        </w:tc>
-        <w:tc>
-          <w:tcPr>
-            <w:tcW w:type="dxa" w:w="3024"/>
-          </w:tcPr>
-          <w:p>
-            <w:r>
-              <w:rPr>
-                <w:rFonts w:ascii="맑은 고딕" w:hAnsi="맑은 고딕"/>
-                <w:sz w:val="18"/>
-              </w:rPr>
-              <w:t>Full cell 장기 평가, Post-mortem 분석, 설계 원칙 도출</w:t>
-            </w:r>
-          </w:p>
-        </w:tc>
-        <w:tc>
-          <w:tcPr>
-            <w:tcW w:type="dxa" w:w="3024"/>
-          </w:tcPr>
-          <w:p>
-            <w:r>
-              <w:rPr>
-                <w:rFonts w:ascii="맑은 고딕" w:hAnsi="맑은 고딕"/>
-                <w:sz w:val="18"/>
-              </w:rPr>
-              <w:t>SCI 논문 1편, 특허 출원, 설계 원칙 제안</w:t>
+              <w:t>SCI 논문 1편, 인공 SEI 설계 원칙 제안, 특허 등록</w:t>
             </w:r>
           </w:p>
         </w:tc>

</xml_diff>